<commit_message>
PIYA-106: commit outstanding docs, references, ground truth, soundfont and settings
Includes the PIYA-211 Export modal ticket rewrite, WCTP study/ethics documents,
PIYA-205..211 reference mockups, the scan-status spec, ground_truth/, soundfont/piano.sf2,
the choral-conductor agent and .claude/settings.json. Excludes the Word lock file
and the embedded video-analyzer git repo.

Co-Authored-By: Claude Opus 5.5 <noreply@anthropic.com>
Claude-Session: https://claude.ai/code/session_01Y9nWkRU99bkDKAHum62MRP
</commit_message>
<xml_diff>
--- a/docs/studies/PiyaNota_WCTP_Abstract_revised.docx
+++ b/docs/studies/PiyaNota_WCTP_Abstract_revised.docx
@@ -16,6 +16,17 @@
     <w:p>
       <w:pPr>
         <w:spacing w:after="300"/>
+        <w:rPr>
+          <w:b/>
+          <w:bCs/>
+          <w:sz w:val="22"/>
+          <w:szCs w:val="22"/>
+        </w:rPr>
+      </w:pPr>
+    </w:p>
+    <w:p>
+      <w:pPr>
+        <w:spacing w:after="300"/>
         <w:jc w:val="center"/>
         <w:rPr>
           <w:b/>
@@ -200,6 +211,7 @@
           <w:szCs w:val="22"/>
         </w:rPr>
       </w:pPr>
+      <w:commentRangeStart w:id="0"/>
       <w:r>
         <w:rPr>
           <w:b/>
@@ -211,6 +223,15 @@
         </w:rPr>
         <w:t>Abstract</w:t>
       </w:r>
+      <w:commentRangeEnd w:id="0"/>
+      <w:r>
+        <w:rPr>
+          <w:rStyle w:val="CommentReference"/>
+          <w:sz w:val="22"/>
+          <w:szCs w:val="22"/>
+        </w:rPr>
+        <w:commentReference w:id="0"/>
+      </w:r>
     </w:p>
     <w:p>
       <w:pPr>
@@ -226,7 +247,55 @@
           <w:sz w:val="22"/>
           <w:szCs w:val="22"/>
         </w:rPr>
-        <w:t>Choral singing, a centuries-old Filipino tradition, thrives in churches, schools, and communities, yet many choir members cannot read sheet music and learn their parts from conductors. Optical Music Recognition (OMR) models degrade on phone photos and are rarely deployed; commercial apps assume musical literacy, and the only Filipino system is rule-based, piano-only. PiyaNota is an Android app converting smartphone photos of open-score SATB (Soprano, Alto, Tenor, Bass) scores into per-voice piano audio. YOLOv8 isolates each staff; a convolutional recurrent network fine-tuned on multi-font renderings, with a clef and key-signature classifier, transcribes it. On 12 pages, digital and photographed, all 100 staves were detected; camera pitch accuracy reached 83.3–83.4% (88.7–89.1% digital), up from under 5% initially, though symbol error remains 33.8–34.8%. PiyaNota contributes, to our knowledge, the first annotated Filipino SATB dataset, a pipeline tested on phone photos, and an app for singers without formal training.</w:t>
+        <w:t xml:space="preserve">Choral singing is prevalent in Filipino culture, practiced in worship services, schools, and community choirs, yet many choir members have limited music-reading skills and learn parts from conductors. Existing tools fall short: Optical Music Recognition (OMR) models degrade on photos, commercial apps assume musical literacy, SkiMusic, a Filipino-developed system, applies fixed rules to piano scores only, and no annotated Filipino SATB dataset exists. </w:t>
+      </w:r>
+      <w:commentRangeStart w:id="1"/>
+      <w:r>
+        <w:rPr>
+          <w:sz w:val="22"/>
+          <w:szCs w:val="22"/>
+        </w:rPr>
+        <w:t>We present PiyaNota</w:t>
+      </w:r>
+      <w:commentRangeEnd w:id="1"/>
+      <w:r>
+        <w:rPr>
+          <w:rStyle w:val="CommentReference"/>
+          <w:sz w:val="22"/>
+          <w:szCs w:val="22"/>
+        </w:rPr>
+        <w:commentReference w:id="1"/>
+      </w:r>
+      <w:r>
+        <w:rPr>
+          <w:sz w:val="22"/>
+          <w:szCs w:val="22"/>
+        </w:rPr>
+        <w:t xml:space="preserve">, an Android app converting photos of open-score SATB (Soprano, Alto, Tenor, Bass) scores into per-voice piano audio. YOLOv8 isolates staves, and a convolutional recurrent network fine-tuned on multi-font renderings, with a clef and key-signature classifier, transcribes them. </w:t>
+      </w:r>
+      <w:commentRangeStart w:id="2"/>
+      <w:r>
+        <w:rPr>
+          <w:sz w:val="22"/>
+          <w:szCs w:val="22"/>
+        </w:rPr>
+        <w:t>In a 12-page pilot evaluation</w:t>
+      </w:r>
+      <w:commentRangeEnd w:id="2"/>
+      <w:r>
+        <w:rPr>
+          <w:rStyle w:val="CommentReference"/>
+          <w:sz w:val="22"/>
+          <w:szCs w:val="22"/>
+        </w:rPr>
+        <w:commentReference w:id="2"/>
+      </w:r>
+      <w:r>
+        <w:rPr>
+          <w:sz w:val="22"/>
+          <w:szCs w:val="22"/>
+        </w:rPr>
+        <w:t>, all 100 staves were detected; camera pitch accuracy rose from under 5% before fine-tuning to 83.3-83.4% (88.7-89.1% digital), though music symbol error rate remains 33.8-34.8%. PiyaNota offers an annotated Filipino SATB dataset, a deep learning pipeline, and an app for untrained singers.</w:t>
       </w:r>
     </w:p>
     <w:p>
@@ -266,7 +335,7 @@
           <w:sz w:val="22"/>
           <w:szCs w:val="22"/>
         </w:rPr>
-        <w:t>Optical Music Recognition, SATB Choral Music, Music Literacy, Filipino Choral Music, Mobile Application, Camera-Captured Sheet Music, YOLOv8, Convolutional Recurrent Neural Network</w:t>
+        <w:t>Optical Music Recognition, Computer Vision, Deep Learning, Mobile Application, Filipino Choral Music, Musical Literacy</w:t>
       </w:r>
     </w:p>
     <w:p>
@@ -291,6 +360,17 @@
         </w:rPr>
         <w:t>Contact Author</w:t>
       </w:r>
+      <w:r>
+        <w:rPr>
+          <w:b/>
+          <w:bCs/>
+          <w:i/>
+          <w:iCs/>
+          <w:sz w:val="22"/>
+          <w:szCs w:val="22"/>
+        </w:rPr>
+        <w:t>/s</w:t>
+      </w:r>
     </w:p>
     <w:p>
       <w:pPr>
@@ -337,19 +417,122 @@
           <w:sz w:val="22"/>
           <w:szCs w:val="22"/>
         </w:rPr>
-        <w:t xml:space="preserve">Email: </w:t>
-      </w:r>
-      <w:hyperlink r:id="rId4">
+        <w:t>Email:</w:t>
+      </w:r>
+      <w:r>
+        <w:rPr>
+          <w:sz w:val="22"/>
+          <w:szCs w:val="22"/>
+        </w:rPr>
+        <w:t xml:space="preserve"> </w:t>
+      </w:r>
+      <w:hyperlink r:id="rId9" w:history="1">
         <w:r>
           <w:rPr>
-            <w:color w:val="1155CC"/>
+            <w:rStyle w:val="Hyperlink"/>
             <w:sz w:val="22"/>
             <w:szCs w:val="22"/>
-            <w:u w:val="single"/>
           </w:rPr>
-          <w:t>mpv0154@dlsud.edu.ph</w:t>
+          <w:t>MPV0154@dlsud.edu.ph</w:t>
         </w:r>
       </w:hyperlink>
+    </w:p>
+    <w:p>
+      <w:pPr>
+        <w:spacing w:after="20"/>
+        <w:rPr>
+          <w:b/>
+          <w:bCs/>
+        </w:rPr>
+      </w:pPr>
+      <w:r>
+        <w:rPr>
+          <w:sz w:val="22"/>
+          <w:szCs w:val="22"/>
+        </w:rPr>
+        <w:t xml:space="preserve"> </w:t>
+      </w:r>
+    </w:p>
+    <w:p>
+      <w:pPr>
+        <w:spacing w:after="20"/>
+        <w:rPr>
+          <w:sz w:val="22"/>
+          <w:szCs w:val="22"/>
+        </w:rPr>
+      </w:pPr>
+      <w:r>
+        <w:rPr>
+          <w:sz w:val="22"/>
+          <w:szCs w:val="22"/>
+        </w:rPr>
+        <w:t xml:space="preserve">Name: </w:t>
+      </w:r>
+      <w:r>
+        <w:rPr>
+          <w:sz w:val="22"/>
+          <w:szCs w:val="22"/>
+        </w:rPr>
+        <w:t>Tita R. Herradura</w:t>
+      </w:r>
+    </w:p>
+    <w:p>
+      <w:pPr>
+        <w:spacing w:after="20"/>
+        <w:rPr>
+          <w:sz w:val="22"/>
+          <w:szCs w:val="22"/>
+        </w:rPr>
+      </w:pPr>
+      <w:r>
+        <w:rPr>
+          <w:sz w:val="22"/>
+          <w:szCs w:val="22"/>
+        </w:rPr>
+        <w:t xml:space="preserve">Phone: </w:t>
+      </w:r>
+      <w:r>
+        <w:rPr>
+          <w:sz w:val="22"/>
+          <w:szCs w:val="22"/>
+        </w:rPr>
+        <w:t>09234019514</w:t>
+      </w:r>
+    </w:p>
+    <w:p>
+      <w:pPr>
+        <w:spacing w:after="20"/>
+        <w:rPr>
+          <w:sz w:val="22"/>
+          <w:szCs w:val="22"/>
+        </w:rPr>
+      </w:pPr>
+      <w:r>
+        <w:rPr>
+          <w:sz w:val="22"/>
+          <w:szCs w:val="22"/>
+        </w:rPr>
+        <w:t xml:space="preserve">Email: </w:t>
+      </w:r>
+      <w:hyperlink r:id="rId10" w:history="1">
+        <w:r>
+          <w:rPr>
+            <w:rStyle w:val="Hyperlink"/>
+            <w:sz w:val="22"/>
+            <w:szCs w:val="22"/>
+          </w:rPr>
+          <w:t>TRHerradura@dlsud.edu.ph</w:t>
+        </w:r>
+      </w:hyperlink>
+    </w:p>
+    <w:p>
+      <w:pPr>
+        <w:spacing w:after="20"/>
+        <w:rPr>
+          <w:sz w:val="22"/>
+          <w:szCs w:val="22"/>
+        </w:rPr>
+      </w:pPr>
     </w:p>
     <w:p>
       <w:pPr>
@@ -446,7 +629,7 @@
                     </pic:cNvPicPr>
                   </pic:nvPicPr>
                   <pic:blipFill>
-                    <a:blip r:embed="rId5" cstate="print">
+                    <a:blip r:embed="rId11" cstate="print">
                       <a:extLst>
                         <a:ext uri="{28A0092B-C50C-407E-A947-70E740481C1C}">
                           <a14:useLocalDpi xmlns:a14="http://schemas.microsoft.com/office/drawing/2010/main" val="0"/>
@@ -1160,9 +1343,7 @@
     </w:p>
     <w:tbl>
       <w:tblPr>
-        <w:tblStyle w:val="a0"/>
         <w:tblW w:w="10768" w:type="dxa"/>
-        <w:tblInd w:w="0" w:type="dxa"/>
         <w:tblBorders>
           <w:top w:val="single" w:sz="4" w:space="0" w:color="000000"/>
           <w:left w:val="single" w:sz="4" w:space="0" w:color="000000"/>
@@ -1172,6 +1353,10 @@
           <w:insideV w:val="single" w:sz="4" w:space="0" w:color="000000"/>
         </w:tblBorders>
         <w:tblLayout w:type="fixed"/>
+        <w:tblCellMar>
+          <w:left w:w="115" w:type="dxa"/>
+          <w:right w:w="115" w:type="dxa"/>
+        </w:tblCellMar>
         <w:tblLook w:val="0000" w:firstRow="0" w:lastRow="0" w:firstColumn="0" w:lastColumn="0" w:noHBand="0" w:noVBand="0"/>
       </w:tblPr>
       <w:tblGrid>
@@ -1246,7 +1431,7 @@
                           <pic:cNvPicPr preferRelativeResize="0"/>
                         </pic:nvPicPr>
                         <pic:blipFill>
-                          <a:blip r:embed="rId6"/>
+                          <a:blip r:embed="rId12"/>
                           <a:srcRect/>
                           <a:stretch>
                             <a:fillRect/>
@@ -1334,7 +1519,7 @@
                           <pic:cNvPicPr preferRelativeResize="0"/>
                         </pic:nvPicPr>
                         <pic:blipFill>
-                          <a:blip r:embed="rId7"/>
+                          <a:blip r:embed="rId13"/>
                           <a:srcRect/>
                           <a:stretch>
                             <a:fillRect/>
@@ -1456,6 +1641,95 @@
     </w:sectPr>
   </w:body>
 </w:document>
+</file>
+
+<file path=word/comments.xml><?xml version="1.0" encoding="utf-8"?>
+<w:comments xmlns:wpc="http://schemas.microsoft.com/office/word/2010/wordprocessingCanvas" xmlns:cx="http://schemas.microsoft.com/office/drawing/2014/chartex" xmlns:cx1="http://schemas.microsoft.com/office/drawing/2015/9/8/chartex" xmlns:cx2="http://schemas.microsoft.com/office/drawing/2015/10/21/chartex" xmlns:cx3="http://schemas.microsoft.com/office/drawing/2016/5/9/chartex" xmlns:cx4="http://schemas.microsoft.com/office/drawing/2016/5/10/chartex" xmlns:cx5="http://schemas.microsoft.com/office/drawing/2016/5/11/chartex" xmlns:cx6="http://schemas.microsoft.com/office/drawing/2016/5/12/chartex" xmlns:cx7="http://schemas.microsoft.com/office/drawing/2016/5/13/chartex" xmlns:cx8="http://schemas.microsoft.com/office/drawing/2016/5/14/chartex" xmlns:mc="http://schemas.openxmlformats.org/markup-compatibility/2006" xmlns:aink="http://schemas.microsoft.com/office/drawing/2016/ink" xmlns:am3d="http://schemas.microsoft.com/office/drawing/2017/model3d" xmlns:o="urn:schemas-microsoft-com:office:office" xmlns:oel="http://schemas.microsoft.com/office/2019/extlst" xmlns:r="http://schemas.openxmlformats.org/officeDocument/2006/relationships" xmlns:m="http://schemas.openxmlformats.org/officeDocument/2006/math" xmlns:v="urn:schemas-microsoft-com:vml" xmlns:wp14="http://schemas.microsoft.com/office/word/2010/wordprocessingDrawing" xmlns:wp="http://schemas.openxmlformats.org/drawingml/2006/wordprocessingDrawing" xmlns:w10="urn:schemas-microsoft-com:office:word" xmlns:w="http://schemas.openxmlformats.org/wordprocessingml/2006/main" xmlns:w14="http://schemas.microsoft.com/office/word/2010/wordml" xmlns:w15="http://schemas.microsoft.com/office/word/2012/wordml" xmlns:w16cex="http://schemas.microsoft.com/office/word/2018/wordml/cex" xmlns:w16cid="http://schemas.microsoft.com/office/word/2016/wordml/cid" xmlns:w16="http://schemas.microsoft.com/office/word/2018/wordml" xmlns:w16du="http://schemas.microsoft.com/office/word/2023/wordml/word16du" xmlns:w16sdtdh="http://schemas.microsoft.com/office/word/2020/wordml/sdtdatahash" xmlns:w16sdtfl="http://schemas.microsoft.com/office/word/2024/wordml/sdtformatlock" xmlns:w16se="http://schemas.microsoft.com/office/word/2015/wordml/symex" xmlns:wpg="http://schemas.microsoft.com/office/word/2010/wordprocessingGroup" xmlns:wpi="http://schemas.microsoft.com/office/word/2010/wordprocessingInk" xmlns:wne="http://schemas.microsoft.com/office/word/2006/wordml" xmlns:wps="http://schemas.microsoft.com/office/word/2010/wordprocessingShape" mc:Ignorable="w14 w15 w16se w16cid w16 w16cex w16sdtdh w16sdtfl w16du wp14">
+  <w:comment w:id="0" w:author="PAULA SOPHIA MACALINDONG" w:date="2026-09-29T17:09:00Z" w:initials="PSM">
+    <w:p>
+      <w:pPr>
+        <w:pStyle w:val="CommentText"/>
+      </w:pPr>
+      <w:r>
+        <w:rPr>
+          <w:rStyle w:val="CommentReference"/>
+        </w:rPr>
+        <w:annotationRef/>
+      </w:r>
+      <w:r>
+        <w:t>Revised abstract, making flow of sentences more cohesive</w:t>
+      </w:r>
+    </w:p>
+  </w:comment>
+  <w:comment w:id="1" w:author="PAULA SOPHIA MACALINDONG" w:date="2026-09-29T17:14:00Z" w:initials="PSM">
+    <w:p>
+      <w:pPr>
+        <w:pStyle w:val="CommentText"/>
+      </w:pPr>
+      <w:r>
+        <w:rPr>
+          <w:rStyle w:val="CommentReference"/>
+        </w:rPr>
+        <w:annotationRef/>
+      </w:r>
+      <w:r>
+        <w:t>Applied comment</w:t>
+      </w:r>
+    </w:p>
+  </w:comment>
+  <w:comment w:id="2" w:author="PAULA SOPHIA MACALINDONG" w:date="2026-09-29T17:14:00Z" w:initials="PSM">
+    <w:p>
+      <w:pPr>
+        <w:pStyle w:val="CommentText"/>
+      </w:pPr>
+      <w:r>
+        <w:rPr>
+          <w:rStyle w:val="CommentReference"/>
+        </w:rPr>
+        <w:annotationRef/>
+      </w:r>
+      <w:r>
+        <w:t>Applied comment</w:t>
+      </w:r>
+    </w:p>
+  </w:comment>
+</w:comments>
+</file>
+
+<file path=word/commentsExtended.xml><?xml version="1.0" encoding="utf-8"?>
+<w15:commentsEx xmlns:wpc="http://schemas.microsoft.com/office/word/2010/wordprocessingCanvas" xmlns:cx="http://schemas.microsoft.com/office/drawing/2014/chartex" xmlns:cx1="http://schemas.microsoft.com/office/drawing/2015/9/8/chartex" xmlns:cx2="http://schemas.microsoft.com/office/drawing/2015/10/21/chartex" xmlns:cx3="http://schemas.microsoft.com/office/drawing/2016/5/9/chartex" xmlns:cx4="http://schemas.microsoft.com/office/drawing/2016/5/10/chartex" xmlns:cx5="http://schemas.microsoft.com/office/drawing/2016/5/11/chartex" xmlns:cx6="http://schemas.microsoft.com/office/drawing/2016/5/12/chartex" xmlns:cx7="http://schemas.microsoft.com/office/drawing/2016/5/13/chartex" xmlns:cx8="http://schemas.microsoft.com/office/drawing/2016/5/14/chartex" xmlns:mc="http://schemas.openxmlformats.org/markup-compatibility/2006" xmlns:aink="http://schemas.microsoft.com/office/drawing/2016/ink" xmlns:am3d="http://schemas.microsoft.com/office/drawing/2017/model3d" xmlns:o="urn:schemas-microsoft-com:office:office" xmlns:oel="http://schemas.microsoft.com/office/2019/extlst" xmlns:r="http://schemas.openxmlformats.org/officeDocument/2006/relationships" xmlns:m="http://schemas.openxmlformats.org/officeDocument/2006/math" xmlns:v="urn:schemas-microsoft-com:vml" xmlns:wp14="http://schemas.microsoft.com/office/word/2010/wordprocessingDrawing" xmlns:wp="http://schemas.openxmlformats.org/drawingml/2006/wordprocessingDrawing" xmlns:w10="urn:schemas-microsoft-com:office:word" xmlns:w="http://schemas.openxmlformats.org/wordprocessingml/2006/main" xmlns:w14="http://schemas.microsoft.com/office/word/2010/wordml" xmlns:w15="http://schemas.microsoft.com/office/word/2012/wordml" xmlns:w16cex="http://schemas.microsoft.com/office/word/2018/wordml/cex" xmlns:w16cid="http://schemas.microsoft.com/office/word/2016/wordml/cid" xmlns:w16="http://schemas.microsoft.com/office/word/2018/wordml" xmlns:w16du="http://schemas.microsoft.com/office/word/2023/wordml/word16du" xmlns:w16sdtdh="http://schemas.microsoft.com/office/word/2020/wordml/sdtdatahash" xmlns:w16sdtfl="http://schemas.microsoft.com/office/word/2024/wordml/sdtformatlock" xmlns:w16se="http://schemas.microsoft.com/office/word/2015/wordml/symex" xmlns:wpg="http://schemas.microsoft.com/office/word/2010/wordprocessingGroup" xmlns:wpi="http://schemas.microsoft.com/office/word/2010/wordprocessingInk" xmlns:wne="http://schemas.microsoft.com/office/word/2006/wordml" xmlns:wps="http://schemas.microsoft.com/office/word/2010/wordprocessingShape" mc:Ignorable="w14 w15 w16se w16cid w16 w16cex w16sdtdh w16sdtfl w16du wp14">
+  <w15:commentEx w15:paraId="6318394A" w15:done="0"/>
+  <w15:commentEx w15:paraId="5757F10D" w15:done="0"/>
+  <w15:commentEx w15:paraId="1BD3DCD6" w15:done="0"/>
+</w15:commentsEx>
+</file>
+
+<file path=word/commentsExtensible.xml><?xml version="1.0" encoding="utf-8"?>
+<w16cex:commentsExtensible xmlns:wpc="http://schemas.microsoft.com/office/word/2010/wordprocessingCanvas" xmlns:cx="http://schemas.microsoft.com/office/drawing/2014/chartex" xmlns:cx1="http://schemas.microsoft.com/office/drawing/2015/9/8/chartex" xmlns:cx2="http://schemas.microsoft.com/office/drawing/2015/10/21/chartex" xmlns:cx3="http://schemas.microsoft.com/office/drawing/2016/5/9/chartex" xmlns:cx4="http://schemas.microsoft.com/office/drawing/2016/5/10/chartex" xmlns:cx5="http://schemas.microsoft.com/office/drawing/2016/5/11/chartex" xmlns:cx6="http://schemas.microsoft.com/office/drawing/2016/5/12/chartex" xmlns:cx7="http://schemas.microsoft.com/office/drawing/2016/5/13/chartex" xmlns:cx8="http://schemas.microsoft.com/office/drawing/2016/5/14/chartex" xmlns:cr="http://schemas.microsoft.com/office/comments/2020/reactions" xmlns:mc="http://schemas.openxmlformats.org/markup-compatibility/2006" xmlns:aink="http://schemas.microsoft.com/office/drawing/2016/ink" xmlns:am3d="http://schemas.microsoft.com/office/drawing/2017/model3d" xmlns:o="urn:schemas-microsoft-com:office:office" xmlns:oel="http://schemas.microsoft.com/office/2019/extlst" xmlns:r="http://schemas.openxmlformats.org/officeDocument/2006/relationships" xmlns:m="http://schemas.openxmlformats.org/officeDocument/2006/math" xmlns:v="urn:schemas-microsoft-com:vml" xmlns:wp14="http://schemas.microsoft.com/office/word/2010/wordprocessingDrawing" xmlns:wp="http://schemas.openxmlformats.org/drawingml/2006/wordprocessingDrawing" xmlns:w10="urn:schemas-microsoft-com:office:word" xmlns:w="http://schemas.openxmlformats.org/wordprocessingml/2006/main" xmlns:w14="http://schemas.microsoft.com/office/word/2010/wordml" xmlns:w15="http://schemas.microsoft.com/office/word/2012/wordml" xmlns:w16cex="http://schemas.microsoft.com/office/word/2018/wordml/cex" xmlns:w16cid="http://schemas.microsoft.com/office/word/2016/wordml/cid" xmlns:w16="http://schemas.microsoft.com/office/word/2018/wordml" xmlns:w16du="http://schemas.microsoft.com/office/word/2023/wordml/word16du" xmlns:w16sdtdh="http://schemas.microsoft.com/office/word/2020/wordml/sdtdatahash" xmlns:w16sdtfl="http://schemas.microsoft.com/office/word/2024/wordml/sdtformatlock" xmlns:w16se="http://schemas.microsoft.com/office/word/2015/wordml/symex" xmlns:wpg="http://schemas.microsoft.com/office/word/2010/wordprocessingGroup" xmlns:wpi="http://schemas.microsoft.com/office/word/2010/wordprocessingInk" xmlns:wne="http://schemas.microsoft.com/office/word/2006/wordml" xmlns:wps="http://schemas.microsoft.com/office/word/2010/wordprocessingShape" mc:Ignorable="w14 w15 w16se w16cid w16 w16cex w16sdtdh w16sdtfl cr w16du wp14">
+  <w16cex:commentExtensible w16cex:durableId="3C6C523D" w16cex:dateUtc="2026-09-29T09:09:00Z"/>
+  <w16cex:commentExtensible w16cex:durableId="0F222982" w16cex:dateUtc="2026-09-29T09:14:00Z"/>
+  <w16cex:commentExtensible w16cex:durableId="573AEB44" w16cex:dateUtc="2026-09-29T09:14:00Z"/>
+</w16cex:commentsExtensible>
+</file>
+
+<file path=word/commentsIds.xml><?xml version="1.0" encoding="utf-8"?>
+<w16cid:commentsIds xmlns:wpc="http://schemas.microsoft.com/office/word/2010/wordprocessingCanvas" xmlns:cx="http://schemas.microsoft.com/office/drawing/2014/chartex" xmlns:cx1="http://schemas.microsoft.com/office/drawing/2015/9/8/chartex" xmlns:cx2="http://schemas.microsoft.com/office/drawing/2015/10/21/chartex" xmlns:cx3="http://schemas.microsoft.com/office/drawing/2016/5/9/chartex" xmlns:cx4="http://schemas.microsoft.com/office/drawing/2016/5/10/chartex" xmlns:cx5="http://schemas.microsoft.com/office/drawing/2016/5/11/chartex" xmlns:cx6="http://schemas.microsoft.com/office/drawing/2016/5/12/chartex" xmlns:cx7="http://schemas.microsoft.com/office/drawing/2016/5/13/chartex" xmlns:cx8="http://schemas.microsoft.com/office/drawing/2016/5/14/chartex" xmlns:mc="http://schemas.openxmlformats.org/markup-compatibility/2006" xmlns:aink="http://schemas.microsoft.com/office/drawing/2016/ink" xmlns:am3d="http://schemas.microsoft.com/office/drawing/2017/model3d" xmlns:o="urn:schemas-microsoft-com:office:office" xmlns:oel="http://schemas.microsoft.com/office/2019/extlst" xmlns:r="http://schemas.openxmlformats.org/officeDocument/2006/relationships" xmlns:m="http://schemas.openxmlformats.org/officeDocument/2006/math" xmlns:v="urn:schemas-microsoft-com:vml" xmlns:wp14="http://schemas.microsoft.com/office/word/2010/wordprocessingDrawing" xmlns:wp="http://schemas.openxmlformats.org/drawingml/2006/wordprocessingDrawing" xmlns:w10="urn:schemas-microsoft-com:office:word" xmlns:w="http://schemas.openxmlformats.org/wordprocessingml/2006/main" xmlns:w14="http://schemas.microsoft.com/office/word/2010/wordml" xmlns:w15="http://schemas.microsoft.com/office/word/2012/wordml" xmlns:w16cex="http://schemas.microsoft.com/office/word/2018/wordml/cex" xmlns:w16cid="http://schemas.microsoft.com/office/word/2016/wordml/cid" xmlns:w16="http://schemas.microsoft.com/office/word/2018/wordml" xmlns:w16du="http://schemas.microsoft.com/office/word/2023/wordml/word16du" xmlns:w16sdtdh="http://schemas.microsoft.com/office/word/2020/wordml/sdtdatahash" xmlns:w16sdtfl="http://schemas.microsoft.com/office/word/2024/wordml/sdtformatlock" xmlns:w16se="http://schemas.microsoft.com/office/word/2015/wordml/symex" xmlns:wpg="http://schemas.microsoft.com/office/word/2010/wordprocessingGroup" xmlns:wpi="http://schemas.microsoft.com/office/word/2010/wordprocessingInk" xmlns:wne="http://schemas.microsoft.com/office/word/2006/wordml" xmlns:wps="http://schemas.microsoft.com/office/word/2010/wordprocessingShape" mc:Ignorable="w14 w15 w16se w16cid w16 w16cex w16sdtdh w16sdtfl w16du wp14">
+  <w16cid:commentId w16cid:paraId="6318394A" w16cid:durableId="3C6C523D"/>
+  <w16cid:commentId w16cid:paraId="5757F10D" w16cid:durableId="0F222982"/>
+  <w16cid:commentId w16cid:paraId="1BD3DCD6" w16cid:durableId="573AEB44"/>
+</w16cid:commentsIds>
+</file>
+
+<file path=word/numbering.xml><?xml version="1.0" encoding="utf-8"?>
+<w:numbering xmlns:wpc="http://schemas.microsoft.com/office/word/2010/wordprocessingCanvas" xmlns:cx="http://schemas.microsoft.com/office/drawing/2014/chartex" xmlns:cx1="http://schemas.microsoft.com/office/drawing/2015/9/8/chartex" xmlns:cx2="http://schemas.microsoft.com/office/drawing/2015/10/21/chartex" xmlns:cx3="http://schemas.microsoft.com/office/drawing/2016/5/9/chartex" xmlns:cx4="http://schemas.microsoft.com/office/drawing/2016/5/10/chartex" xmlns:cx5="http://schemas.microsoft.com/office/drawing/2016/5/11/chartex" xmlns:cx6="http://schemas.microsoft.com/office/drawing/2016/5/12/chartex" xmlns:cx7="http://schemas.microsoft.com/office/drawing/2016/5/13/chartex" xmlns:cx8="http://schemas.microsoft.com/office/drawing/2016/5/14/chartex" xmlns:mc="http://schemas.openxmlformats.org/markup-compatibility/2006" xmlns:aink="http://schemas.microsoft.com/office/drawing/2016/ink" xmlns:am3d="http://schemas.microsoft.com/office/drawing/2017/model3d" xmlns:o="urn:schemas-microsoft-com:office:office" xmlns:oel="http://schemas.microsoft.com/office/2019/extlst" xmlns:r="http://schemas.openxmlformats.org/officeDocument/2006/relationships" xmlns:m="http://schemas.openxmlformats.org/officeDocument/2006/math" xmlns:v="urn:schemas-microsoft-com:vml" xmlns:wp14="http://schemas.microsoft.com/office/word/2010/wordprocessingDrawing" xmlns:wp="http://schemas.openxmlformats.org/drawingml/2006/wordprocessingDrawing" xmlns:w10="urn:schemas-microsoft-com:office:word" xmlns:w="http://schemas.openxmlformats.org/wordprocessingml/2006/main" xmlns:w14="http://schemas.microsoft.com/office/word/2010/wordml" xmlns:w15="http://schemas.microsoft.com/office/word/2012/wordml" xmlns:w16cex="http://schemas.microsoft.com/office/word/2018/wordml/cex" xmlns:w16cid="http://schemas.microsoft.com/office/word/2016/wordml/cid" xmlns:w16="http://schemas.microsoft.com/office/word/2018/wordml" xmlns:w16du="http://schemas.microsoft.com/office/word/2023/wordml/word16du" xmlns:w16sdtdh="http://schemas.microsoft.com/office/word/2020/wordml/sdtdatahash" xmlns:w16sdtfl="http://schemas.microsoft.com/office/word/2024/wordml/sdtformatlock" xmlns:w16se="http://schemas.microsoft.com/office/word/2015/wordml/symex" xmlns:wpg="http://schemas.microsoft.com/office/word/2010/wordprocessingGroup" xmlns:wpi="http://schemas.microsoft.com/office/word/2010/wordprocessingInk" xmlns:wne="http://schemas.microsoft.com/office/word/2006/wordml" xmlns:wps="http://schemas.microsoft.com/office/word/2010/wordprocessingShape" mc:Ignorable="w14 w15 w16se w16cid w16 w16cex w16sdtdh w16sdtfl w16du wp14"/>
+</file>
+
+<file path=word/people.xml><?xml version="1.0" encoding="utf-8"?>
+<w15:people xmlns:wpc="http://schemas.microsoft.com/office/word/2010/wordprocessingCanvas" xmlns:cx="http://schemas.microsoft.com/office/drawing/2014/chartex" xmlns:cx1="http://schemas.microsoft.com/office/drawing/2015/9/8/chartex" xmlns:cx2="http://schemas.microsoft.com/office/drawing/2015/10/21/chartex" xmlns:cx3="http://schemas.microsoft.com/office/drawing/2016/5/9/chartex" xmlns:cx4="http://schemas.microsoft.com/office/drawing/2016/5/10/chartex" xmlns:cx5="http://schemas.microsoft.com/office/drawing/2016/5/11/chartex" xmlns:cx6="http://schemas.microsoft.com/office/drawing/2016/5/12/chartex" xmlns:cx7="http://schemas.microsoft.com/office/drawing/2016/5/13/chartex" xmlns:cx8="http://schemas.microsoft.com/office/drawing/2016/5/14/chartex" xmlns:mc="http://schemas.openxmlformats.org/markup-compatibility/2006" xmlns:aink="http://schemas.microsoft.com/office/drawing/2016/ink" xmlns:am3d="http://schemas.microsoft.com/office/drawing/2017/model3d" xmlns:o="urn:schemas-microsoft-com:office:office" xmlns:oel="http://schemas.microsoft.com/office/2019/extlst" xmlns:r="http://schemas.openxmlformats.org/officeDocument/2006/relationships" xmlns:m="http://schemas.openxmlformats.org/officeDocument/2006/math" xmlns:v="urn:schemas-microsoft-com:vml" xmlns:wp14="http://schemas.microsoft.com/office/word/2010/wordprocessingDrawing" xmlns:wp="http://schemas.openxmlformats.org/drawingml/2006/wordprocessingDrawing" xmlns:w10="urn:schemas-microsoft-com:office:word" xmlns:w="http://schemas.openxmlformats.org/wordprocessingml/2006/main" xmlns:w14="http://schemas.microsoft.com/office/word/2010/wordml" xmlns:w15="http://schemas.microsoft.com/office/word/2012/wordml" xmlns:w16cex="http://schemas.microsoft.com/office/word/2018/wordml/cex" xmlns:w16cid="http://schemas.microsoft.com/office/word/2016/wordml/cid" xmlns:w16="http://schemas.microsoft.com/office/word/2018/wordml" xmlns:w16du="http://schemas.microsoft.com/office/word/2023/wordml/word16du" xmlns:w16sdtdh="http://schemas.microsoft.com/office/word/2020/wordml/sdtdatahash" xmlns:w16sdtfl="http://schemas.microsoft.com/office/word/2024/wordml/sdtformatlock" xmlns:w16se="http://schemas.microsoft.com/office/word/2015/wordml/symex" xmlns:wpg="http://schemas.microsoft.com/office/word/2010/wordprocessingGroup" xmlns:wpi="http://schemas.microsoft.com/office/word/2010/wordprocessingInk" xmlns:wne="http://schemas.microsoft.com/office/word/2006/wordml" xmlns:wps="http://schemas.microsoft.com/office/word/2010/wordprocessingShape" mc:Ignorable="w14 w15 w16se w16cid w16 w16cex w16sdtdh w16sdtfl w16du wp14">
+  <w15:person w15:author="PAULA SOPHIA MACALINDONG">
+    <w15:presenceInfo w15:providerId="AD" w15:userId="S::MPV0154@dlsud.edu.ph::f9dac24e-0cfe-4f0c-8bf8-4ff00d905481"/>
+  </w15:person>
+</w15:people>
 </file>
 
 <file path=word/styles.xml><?xml version="1.0" encoding="utf-8"?>
@@ -1850,6 +2124,7 @@
   <w:style w:type="paragraph" w:default="1" w:styleId="Normal">
     <w:name w:val="Normal"/>
     <w:qFormat/>
+    <w:rsid w:val="00EA3773"/>
   </w:style>
   <w:style w:type="paragraph" w:styleId="Heading1">
     <w:name w:val="heading 1"/>
@@ -1992,7 +2267,6 @@
   <w:style w:type="character" w:default="1" w:styleId="DefaultParagraphFont">
     <w:name w:val="Default Paragraph Font"/>
     <w:uiPriority w:val="1"/>
-    <w:semiHidden/>
     <w:unhideWhenUsed/>
   </w:style>
   <w:style w:type="table" w:default="1" w:styleId="TableNormal">
@@ -2093,6 +2367,79 @@
         <w:right w:w="115" w:type="dxa"/>
       </w:tblCellMar>
     </w:tblPr>
+  </w:style>
+  <w:style w:type="paragraph" w:styleId="CommentText">
+    <w:name w:val="annotation text"/>
+    <w:basedOn w:val="Normal"/>
+    <w:link w:val="CommentTextChar"/>
+    <w:uiPriority w:val="99"/>
+    <w:unhideWhenUsed/>
+  </w:style>
+  <w:style w:type="character" w:customStyle="1" w:styleId="CommentTextChar">
+    <w:name w:val="Comment Text Char"/>
+    <w:basedOn w:val="DefaultParagraphFont"/>
+    <w:link w:val="CommentText"/>
+    <w:uiPriority w:val="99"/>
+  </w:style>
+  <w:style w:type="character" w:styleId="CommentReference">
+    <w:name w:val="annotation reference"/>
+    <w:basedOn w:val="DefaultParagraphFont"/>
+    <w:uiPriority w:val="99"/>
+    <w:semiHidden/>
+    <w:unhideWhenUsed/>
+    <w:rPr>
+      <w:sz w:val="16"/>
+      <w:szCs w:val="16"/>
+    </w:rPr>
+  </w:style>
+  <w:style w:type="paragraph" w:styleId="CommentSubject">
+    <w:name w:val="annotation subject"/>
+    <w:basedOn w:val="CommentText"/>
+    <w:next w:val="CommentText"/>
+    <w:link w:val="CommentSubjectChar"/>
+    <w:uiPriority w:val="99"/>
+    <w:semiHidden/>
+    <w:unhideWhenUsed/>
+    <w:rsid w:val="00EF32BF"/>
+    <w:rPr>
+      <w:b/>
+      <w:bCs/>
+    </w:rPr>
+  </w:style>
+  <w:style w:type="character" w:customStyle="1" w:styleId="CommentSubjectChar">
+    <w:name w:val="Comment Subject Char"/>
+    <w:basedOn w:val="CommentTextChar"/>
+    <w:link w:val="CommentSubject"/>
+    <w:uiPriority w:val="99"/>
+    <w:semiHidden/>
+    <w:rsid w:val="00EF32BF"/>
+    <w:rPr>
+      <w:b/>
+      <w:bCs/>
+    </w:rPr>
+  </w:style>
+  <w:style w:type="character" w:styleId="Hyperlink">
+    <w:name w:val="Hyperlink"/>
+    <w:basedOn w:val="DefaultParagraphFont"/>
+    <w:uiPriority w:val="99"/>
+    <w:unhideWhenUsed/>
+    <w:rsid w:val="00E5178C"/>
+    <w:rPr>
+      <w:color w:val="0000FF" w:themeColor="hyperlink"/>
+      <w:u w:val="single"/>
+    </w:rPr>
+  </w:style>
+  <w:style w:type="character" w:styleId="UnresolvedMention">
+    <w:name w:val="Unresolved Mention"/>
+    <w:basedOn w:val="DefaultParagraphFont"/>
+    <w:uiPriority w:val="99"/>
+    <w:semiHidden/>
+    <w:unhideWhenUsed/>
+    <w:rsid w:val="00E5178C"/>
+    <w:rPr>
+      <w:color w:val="605E5C"/>
+      <w:shd w:val="clear" w:color="auto" w:fill="E1DFDD"/>
+    </w:rPr>
   </w:style>
 </w:styles>
 </file>

</xml_diff>